<commit_message>
feat: Add Download button to exhibit cards and viewer
Downloading an exhibit previously required opening the viewer modal.
Extract the blob-download logic out of handleDownloadViewedDocx into a
shared downloadExhibitFile() so both the card grid and the modal header
can use it, each with its own spinner state. Filenames now fall back to
the exhibit name rather than a generic exhibit.docx, and the card button
row wraps so four buttons do not squeeze.

Also syncs backend-exhibits/ with the current exhibit set: 343 removed,
2 replaced, 10 added.

Co-Authored-By: Claude Opus 5 (1M context) <noreply@anthropic.com>
</commit_message>
<xml_diff>
--- a/backend-exhibits/Box to SharePoint Online Standard Plan - Standard Include.docx
+++ b/backend-exhibits/Box to SharePoint Online Standard Plan - Standard Include.docx
@@ -16,6 +16,7 @@
         <w:tblCellMar>
           <w:top w:w="95" w:type="dxa"/>
           <w:left w:w="63" w:type="dxa"/>
+          <w:bottom w:w="0" w:type="dxa"/>
           <w:right w:w="82" w:type="dxa"/>
         </w:tblCellMar>
         <w:tblLook w:val="04A0" w:firstRow="1" w:lastRow="0" w:firstColumn="1" w:lastColumn="0" w:noHBand="0" w:noVBand="1"/>
@@ -42,20 +43,15 @@
           </w:tcPr>
           <w:p>
             <w:pPr>
+              <w:spacing w:after="0"/>
               <w:ind w:left="19"/>
               <w:jc w:val="center"/>
-              <w:rPr>
-                <w:rFonts w:ascii="Arial" w:hAnsi="Arial" w:cs="Arial" w:eastAsia="Arial"/>
-                <w:sz w:val="21"/>
-                <w:szCs w:val="21"/>
-              </w:rPr>
-            </w:pPr>
-            <w:r>
-              <w:rPr>
-                <w:rFonts w:ascii="Arial" w:hAnsi="Arial" w:cs="Arial" w:eastAsia="Arial"/>
+            </w:pPr>
+            <w:r>
+              <w:rPr>
+                <w:rFonts w:ascii="Arial" w:eastAsia="Arial" w:hAnsi="Arial" w:cs="Arial"/>
                 <w:b/>
                 <w:sz w:val="21"/>
-                <w:szCs w:val="21"/>
               </w:rPr>
               <w:t>INCLUDED IN BOX TO SHAREPOINT ONLINE MIGRATION FEATURES</w:t>
             </w:r>
@@ -78,71 +74,30 @@
           </w:tcPr>
           <w:p>
             <w:pPr>
+              <w:spacing w:after="0"/>
               <w:ind w:left="3"/>
-              <w:rPr>
-                <w:rFonts w:ascii="Arial" w:hAnsi="Arial" w:cs="Arial" w:eastAsia="Arial"/>
-                <w:sz w:val="21"/>
-                <w:szCs w:val="21"/>
-              </w:rPr>
-            </w:pPr>
-            <w:r>
-              <w:rPr>
-                <w:rFonts w:ascii="Arial" w:hAnsi="Arial" w:cs="Arial" w:eastAsia="Arial"/>
+            </w:pPr>
+            <w:r>
+              <w:rPr>
+                <w:rFonts w:ascii="Arial" w:eastAsia="Arial" w:hAnsi="Arial" w:cs="Arial"/>
                 <w:b/>
                 <w:sz w:val="21"/>
-                <w:szCs w:val="21"/>
-              </w:rPr>
-              <w:t xml:space="preserve">Data </w:t>
-            </w:r>
-            <w:proofErr w:type="gramStart"/>
-            <w:r>
-              <w:rPr>
-                <w:rFonts w:ascii="Arial" w:hAnsi="Arial" w:cs="Arial" w:eastAsia="Arial"/>
+              </w:rPr>
+              <w:t xml:space="preserve">Data Migration(Files &amp; </w:t>
+            </w:r>
+          </w:p>
+          <w:p>
+            <w:pPr>
+              <w:spacing w:after="0"/>
+              <w:ind w:left="3"/>
+            </w:pPr>
+            <w:r>
+              <w:rPr>
+                <w:rFonts w:ascii="Arial" w:eastAsia="Arial" w:hAnsi="Arial" w:cs="Arial"/>
                 <w:b/>
                 <w:sz w:val="21"/>
-                <w:szCs w:val="21"/>
-              </w:rPr>
-              <w:t>Migration(</w:t>
-            </w:r>
-            <w:proofErr w:type="gramEnd"/>
-            <w:r>
-              <w:rPr>
-                <w:rFonts w:ascii="Arial" w:hAnsi="Arial" w:cs="Arial" w:eastAsia="Arial"/>
-                <w:b/>
-                <w:sz w:val="21"/>
-                <w:szCs w:val="21"/>
-              </w:rPr>
-              <w:t xml:space="preserve">Files &amp; </w:t>
-            </w:r>
-          </w:p>
-          <w:p>
-            <w:pPr>
-              <w:ind w:left="3"/>
-              <w:rPr>
-                <w:rFonts w:ascii="Arial" w:hAnsi="Arial" w:cs="Arial" w:eastAsia="Arial"/>
-                <w:sz w:val="21"/>
-                <w:szCs w:val="21"/>
-              </w:rPr>
-            </w:pPr>
-            <w:proofErr w:type="spellStart"/>
-            <w:r>
-              <w:rPr>
-                <w:rFonts w:ascii="Arial" w:hAnsi="Arial" w:cs="Arial" w:eastAsia="Arial"/>
-                <w:b/>
-                <w:sz w:val="21"/>
-                <w:szCs w:val="21"/>
-              </w:rPr>
-              <w:t>Folderswith</w:t>
-            </w:r>
-            <w:proofErr w:type="spellEnd"/>
-            <w:r>
-              <w:rPr>
-                <w:rFonts w:ascii="Arial" w:hAnsi="Arial" w:cs="Arial" w:eastAsia="Arial"/>
-                <w:b/>
-                <w:sz w:val="21"/>
-                <w:szCs w:val="21"/>
-              </w:rPr>
-              <w:t xml:space="preserve"> structure)</w:t>
+              </w:rPr>
+              <w:t>Folderswith structure)</w:t>
             </w:r>
           </w:p>
         </w:tc>
@@ -158,35 +113,19 @@
           </w:tcPr>
           <w:p>
             <w:pPr>
-              <w:rPr>
-                <w:rFonts w:ascii="Arial" w:hAnsi="Arial" w:cs="Arial" w:eastAsia="Arial"/>
-                <w:sz w:val="21"/>
-                <w:szCs w:val="21"/>
-              </w:rPr>
-            </w:pPr>
-            <w:proofErr w:type="spellStart"/>
-            <w:r>
-              <w:rPr>
-                <w:rFonts w:ascii="Arial" w:hAnsi="Arial" w:cs="Arial" w:eastAsia="Arial"/>
-                <w:sz w:val="21"/>
-                <w:szCs w:val="21"/>
-              </w:rPr>
-              <w:t>CloudFuze</w:t>
-            </w:r>
-            <w:proofErr w:type="spellEnd"/>
-            <w:r>
-              <w:rPr>
-                <w:rFonts w:ascii="Arial" w:hAnsi="Arial" w:cs="Arial" w:eastAsia="Arial"/>
-                <w:sz w:val="21"/>
-                <w:szCs w:val="21"/>
-              </w:rPr>
-              <w:t xml:space="preserve"> ensures the seamless migration of the data from the source cloud to destination, preserving the accuracy and integrity of the data structure</w:t>
-            </w:r>
-            <w:r>
-              <w:rPr>
-                <w:rFonts w:ascii="Arial" w:hAnsi="Arial" w:cs="Arial" w:eastAsia="Arial"/>
-                <w:sz w:val="21"/>
-                <w:szCs w:val="21"/>
+              <w:spacing w:after="0"/>
+            </w:pPr>
+            <w:r>
+              <w:rPr>
+                <w:rFonts w:ascii="Arial" w:eastAsia="Arial" w:hAnsi="Arial" w:cs="Arial"/>
+                <w:sz w:val="21"/>
+              </w:rPr>
+              <w:t>CloudFuze ensures the seamless migration of the data from the source cloud to destination, preserving the accuracy and integrity of the data structure</w:t>
+            </w:r>
+            <w:r>
+              <w:rPr>
+                <w:rFonts w:ascii="Times New Roman" w:eastAsia="Times New Roman" w:hAnsi="Times New Roman" w:cs="Times New Roman"/>
+                <w:sz w:val="21"/>
               </w:rPr>
               <w:t>.</w:t>
             </w:r>
@@ -209,19 +148,14 @@
           </w:tcPr>
           <w:p>
             <w:pPr>
+              <w:spacing w:after="0"/>
               <w:ind w:left="3"/>
-              <w:rPr>
-                <w:rFonts w:ascii="Arial" w:hAnsi="Arial" w:cs="Arial" w:eastAsia="Arial"/>
-                <w:sz w:val="21"/>
-                <w:szCs w:val="21"/>
-              </w:rPr>
-            </w:pPr>
-            <w:r>
-              <w:rPr>
-                <w:rFonts w:ascii="Arial" w:hAnsi="Arial" w:cs="Arial" w:eastAsia="Arial"/>
+            </w:pPr>
+            <w:r>
+              <w:rPr>
+                <w:rFonts w:ascii="Arial" w:eastAsia="Arial" w:hAnsi="Arial" w:cs="Arial"/>
                 <w:b/>
                 <w:sz w:val="21"/>
-                <w:szCs w:val="21"/>
               </w:rPr>
               <w:t>Root Folder Permissions</w:t>
             </w:r>
@@ -239,29 +173,14 @@
           </w:tcPr>
           <w:p>
             <w:pPr>
-              <w:rPr>
-                <w:rFonts w:ascii="Arial" w:hAnsi="Arial" w:cs="Arial" w:eastAsia="Arial"/>
-                <w:sz w:val="21"/>
-                <w:szCs w:val="21"/>
-              </w:rPr>
-            </w:pPr>
-            <w:proofErr w:type="spellStart"/>
-            <w:r>
-              <w:rPr>
-                <w:rFonts w:ascii="Arial" w:hAnsi="Arial" w:cs="Arial" w:eastAsia="Arial"/>
-                <w:sz w:val="21"/>
-                <w:szCs w:val="21"/>
-              </w:rPr>
-              <w:t>CloudFuze</w:t>
-            </w:r>
-            <w:proofErr w:type="spellEnd"/>
-            <w:r>
-              <w:rPr>
-                <w:rFonts w:ascii="Arial" w:hAnsi="Arial" w:cs="Arial" w:eastAsia="Arial"/>
-                <w:sz w:val="21"/>
-                <w:szCs w:val="21"/>
-              </w:rPr>
-              <w:t xml:space="preserve"> preserves all root folder permissions along with access levels.</w:t>
+              <w:spacing w:after="0"/>
+            </w:pPr>
+            <w:r>
+              <w:rPr>
+                <w:rFonts w:ascii="Arial" w:eastAsia="Arial" w:hAnsi="Arial" w:cs="Arial"/>
+                <w:sz w:val="21"/>
+              </w:rPr>
+              <w:t>CloudFuze preserves all root folder permissions along with access levels.</w:t>
             </w:r>
           </w:p>
         </w:tc>
@@ -282,19 +201,14 @@
           </w:tcPr>
           <w:p>
             <w:pPr>
+              <w:spacing w:after="0"/>
               <w:ind w:left="3"/>
-              <w:rPr>
-                <w:rFonts w:ascii="Arial" w:hAnsi="Arial" w:cs="Arial" w:eastAsia="Arial"/>
-                <w:sz w:val="21"/>
-                <w:szCs w:val="21"/>
-              </w:rPr>
-            </w:pPr>
-            <w:r>
-              <w:rPr>
-                <w:rFonts w:ascii="Arial" w:hAnsi="Arial" w:cs="Arial" w:eastAsia="Arial"/>
+            </w:pPr>
+            <w:r>
+              <w:rPr>
+                <w:rFonts w:ascii="Arial" w:eastAsia="Arial" w:hAnsi="Arial" w:cs="Arial"/>
                 <w:b/>
                 <w:sz w:val="21"/>
-                <w:szCs w:val="21"/>
               </w:rPr>
               <w:t>Sub Folder Permissions</w:t>
             </w:r>
@@ -312,29 +226,14 @@
           </w:tcPr>
           <w:p>
             <w:pPr>
-              <w:rPr>
-                <w:rFonts w:ascii="Arial" w:hAnsi="Arial" w:cs="Arial" w:eastAsia="Arial"/>
-                <w:sz w:val="21"/>
-                <w:szCs w:val="21"/>
-              </w:rPr>
-            </w:pPr>
-            <w:proofErr w:type="spellStart"/>
-            <w:r>
-              <w:rPr>
-                <w:rFonts w:ascii="Arial" w:hAnsi="Arial" w:cs="Arial" w:eastAsia="Arial"/>
-                <w:sz w:val="21"/>
-                <w:szCs w:val="21"/>
-              </w:rPr>
-              <w:t>CloudFuze</w:t>
-            </w:r>
-            <w:proofErr w:type="spellEnd"/>
-            <w:r>
-              <w:rPr>
-                <w:rFonts w:ascii="Arial" w:hAnsi="Arial" w:cs="Arial" w:eastAsia="Arial"/>
-                <w:sz w:val="21"/>
-                <w:szCs w:val="21"/>
-              </w:rPr>
-              <w:t xml:space="preserve"> preserves all subfolder permissions along with access levels.</w:t>
+              <w:spacing w:after="0"/>
+            </w:pPr>
+            <w:r>
+              <w:rPr>
+                <w:rFonts w:ascii="Arial" w:eastAsia="Arial" w:hAnsi="Arial" w:cs="Arial"/>
+                <w:sz w:val="21"/>
+              </w:rPr>
+              <w:t>CloudFuze preserves all subfolder permissions along with access levels.</w:t>
             </w:r>
           </w:p>
         </w:tc>
@@ -355,19 +254,14 @@
           </w:tcPr>
           <w:p>
             <w:pPr>
+              <w:spacing w:after="0"/>
               <w:ind w:left="3"/>
-              <w:rPr>
-                <w:rFonts w:ascii="Arial" w:hAnsi="Arial" w:cs="Arial" w:eastAsia="Arial"/>
-                <w:sz w:val="21"/>
-                <w:szCs w:val="21"/>
-              </w:rPr>
-            </w:pPr>
-            <w:r>
-              <w:rPr>
-                <w:rFonts w:ascii="Arial" w:hAnsi="Arial" w:cs="Arial" w:eastAsia="Arial"/>
+            </w:pPr>
+            <w:r>
+              <w:rPr>
+                <w:rFonts w:ascii="Arial" w:eastAsia="Arial" w:hAnsi="Arial" w:cs="Arial"/>
                 <w:b/>
                 <w:sz w:val="21"/>
-                <w:szCs w:val="21"/>
               </w:rPr>
               <w:t>Root File Permissions</w:t>
             </w:r>
@@ -385,29 +279,14 @@
           </w:tcPr>
           <w:p>
             <w:pPr>
-              <w:rPr>
-                <w:rFonts w:ascii="Arial" w:hAnsi="Arial" w:cs="Arial" w:eastAsia="Arial"/>
-                <w:sz w:val="21"/>
-                <w:szCs w:val="21"/>
-              </w:rPr>
-            </w:pPr>
-            <w:proofErr w:type="spellStart"/>
-            <w:r>
-              <w:rPr>
-                <w:rFonts w:ascii="Arial" w:hAnsi="Arial" w:cs="Arial" w:eastAsia="Arial"/>
-                <w:sz w:val="21"/>
-                <w:szCs w:val="21"/>
-              </w:rPr>
-              <w:t>CloudFuze</w:t>
-            </w:r>
-            <w:proofErr w:type="spellEnd"/>
-            <w:r>
-              <w:rPr>
-                <w:rFonts w:ascii="Arial" w:hAnsi="Arial" w:cs="Arial" w:eastAsia="Arial"/>
-                <w:sz w:val="21"/>
-                <w:szCs w:val="21"/>
-              </w:rPr>
-              <w:t xml:space="preserve"> preserves all Root file permissions along with access levels.</w:t>
+              <w:spacing w:after="0"/>
+            </w:pPr>
+            <w:r>
+              <w:rPr>
+                <w:rFonts w:ascii="Arial" w:eastAsia="Arial" w:hAnsi="Arial" w:cs="Arial"/>
+                <w:sz w:val="21"/>
+              </w:rPr>
+              <w:t>CloudFuze preserves all Root file permissions along with access levels.</w:t>
             </w:r>
           </w:p>
         </w:tc>
@@ -429,19 +308,14 @@
           </w:tcPr>
           <w:p>
             <w:pPr>
+              <w:spacing w:after="0"/>
               <w:ind w:left="3"/>
-              <w:rPr>
-                <w:rFonts w:ascii="Arial" w:hAnsi="Arial" w:cs="Arial" w:eastAsia="Arial"/>
-                <w:sz w:val="21"/>
-                <w:szCs w:val="21"/>
-              </w:rPr>
-            </w:pPr>
-            <w:r>
-              <w:rPr>
-                <w:rFonts w:ascii="Arial" w:hAnsi="Arial" w:cs="Arial" w:eastAsia="Arial"/>
+            </w:pPr>
+            <w:r>
+              <w:rPr>
+                <w:rFonts w:ascii="Arial" w:eastAsia="Arial" w:hAnsi="Arial" w:cs="Arial"/>
                 <w:b/>
-                <w:sz w:val="21"/>
-                <w:szCs w:val="21"/>
+                <w:sz w:val="19"/>
               </w:rPr>
               <w:t>Inner File Permissions</w:t>
             </w:r>
@@ -459,29 +333,14 @@
           </w:tcPr>
           <w:p>
             <w:pPr>
-              <w:rPr>
-                <w:rFonts w:ascii="Arial" w:hAnsi="Arial" w:cs="Arial" w:eastAsia="Arial"/>
-                <w:sz w:val="21"/>
-                <w:szCs w:val="21"/>
-              </w:rPr>
-            </w:pPr>
-            <w:proofErr w:type="spellStart"/>
-            <w:r>
-              <w:rPr>
-                <w:rFonts w:ascii="Arial" w:hAnsi="Arial" w:cs="Arial" w:eastAsia="Arial"/>
-                <w:sz w:val="21"/>
-                <w:szCs w:val="21"/>
-              </w:rPr>
-              <w:t>CloudFuze</w:t>
-            </w:r>
-            <w:proofErr w:type="spellEnd"/>
-            <w:r>
-              <w:rPr>
-                <w:rFonts w:ascii="Arial" w:hAnsi="Arial" w:cs="Arial" w:eastAsia="Arial"/>
-                <w:sz w:val="21"/>
-                <w:szCs w:val="21"/>
-              </w:rPr>
-              <w:t xml:space="preserve"> preserves all inner file permissions along with access levels.</w:t>
+              <w:spacing w:after="0"/>
+            </w:pPr>
+            <w:r>
+              <w:rPr>
+                <w:rFonts w:ascii="Arial" w:eastAsia="Arial" w:hAnsi="Arial" w:cs="Arial"/>
+                <w:sz w:val="21"/>
+              </w:rPr>
+              <w:t>CloudFuze preserves all inner file permissions along with access levels.</w:t>
             </w:r>
           </w:p>
         </w:tc>
@@ -502,19 +361,14 @@
           </w:tcPr>
           <w:p>
             <w:pPr>
+              <w:spacing w:after="0"/>
               <w:ind w:left="3"/>
-              <w:rPr>
-                <w:rFonts w:ascii="Arial" w:hAnsi="Arial" w:cs="Arial" w:eastAsia="Arial"/>
-                <w:sz w:val="21"/>
-                <w:szCs w:val="21"/>
-              </w:rPr>
-            </w:pPr>
-            <w:r>
-              <w:rPr>
-                <w:rFonts w:ascii="Arial" w:hAnsi="Arial" w:cs="Arial" w:eastAsia="Arial"/>
+            </w:pPr>
+            <w:r>
+              <w:rPr>
+                <w:rFonts w:ascii="Arial" w:eastAsia="Arial" w:hAnsi="Arial" w:cs="Arial"/>
                 <w:b/>
                 <w:sz w:val="21"/>
-                <w:szCs w:val="21"/>
               </w:rPr>
               <w:t>External Shares</w:t>
             </w:r>
@@ -532,47 +386,14 @@
           </w:tcPr>
           <w:p>
             <w:pPr>
-              <w:rPr>
-                <w:rFonts w:ascii="Arial" w:hAnsi="Arial" w:cs="Arial" w:eastAsia="Arial"/>
-                <w:sz w:val="21"/>
-                <w:szCs w:val="21"/>
-              </w:rPr>
-            </w:pPr>
-            <w:proofErr w:type="spellStart"/>
-            <w:r>
-              <w:rPr>
-                <w:rFonts w:ascii="Arial" w:hAnsi="Arial" w:cs="Arial" w:eastAsia="Arial"/>
-                <w:sz w:val="21"/>
-                <w:szCs w:val="21"/>
-              </w:rPr>
-              <w:t>CloudFuze</w:t>
-            </w:r>
-            <w:proofErr w:type="spellEnd"/>
-            <w:r>
-              <w:rPr>
-                <w:rFonts w:ascii="Arial" w:hAnsi="Arial" w:cs="Arial" w:eastAsia="Arial"/>
-                <w:sz w:val="21"/>
-                <w:szCs w:val="21"/>
-              </w:rPr>
-              <w:t xml:space="preserve"> can migrate external </w:t>
-            </w:r>
-            <w:proofErr w:type="gramStart"/>
-            <w:r>
-              <w:rPr>
-                <w:rFonts w:ascii="Arial" w:hAnsi="Arial" w:cs="Arial" w:eastAsia="Arial"/>
-                <w:sz w:val="21"/>
-                <w:szCs w:val="21"/>
-              </w:rPr>
-              <w:t>permissions(</w:t>
-            </w:r>
-            <w:proofErr w:type="gramEnd"/>
-            <w:r>
-              <w:rPr>
-                <w:rFonts w:ascii="Arial" w:hAnsi="Arial" w:cs="Arial" w:eastAsia="Arial"/>
-                <w:sz w:val="21"/>
-                <w:szCs w:val="21"/>
-              </w:rPr>
-              <w:t>Files/Folders shared with people of outside organizations) of files/folders to the destination along with access levels.</w:t>
+              <w:spacing w:after="0"/>
+            </w:pPr>
+            <w:r>
+              <w:rPr>
+                <w:rFonts w:ascii="Arial" w:eastAsia="Arial" w:hAnsi="Arial" w:cs="Arial"/>
+                <w:sz w:val="21"/>
+              </w:rPr>
+              <w:t>CloudFuze can migrate external permissions(Files/Folders shared with people of outside organizations) of files/folders to the destination along with access levels.</w:t>
             </w:r>
           </w:p>
         </w:tc>
@@ -593,19 +414,14 @@
           </w:tcPr>
           <w:p>
             <w:pPr>
+              <w:spacing w:after="0"/>
               <w:ind w:left="3"/>
-              <w:rPr>
-                <w:rFonts w:ascii="Arial" w:hAnsi="Arial" w:cs="Arial" w:eastAsia="Arial"/>
-                <w:sz w:val="21"/>
-                <w:szCs w:val="21"/>
-              </w:rPr>
-            </w:pPr>
-            <w:r>
-              <w:rPr>
-                <w:rFonts w:ascii="Arial" w:hAnsi="Arial" w:cs="Arial" w:eastAsia="Arial"/>
+            </w:pPr>
+            <w:r>
+              <w:rPr>
+                <w:rFonts w:ascii="Arial" w:eastAsia="Arial" w:hAnsi="Arial" w:cs="Arial"/>
                 <w:b/>
                 <w:sz w:val="21"/>
-                <w:szCs w:val="21"/>
               </w:rPr>
               <w:t>Metadata</w:t>
             </w:r>
@@ -623,17 +439,12 @@
           </w:tcPr>
           <w:p>
             <w:pPr>
-              <w:rPr>
-                <w:rFonts w:ascii="Arial" w:hAnsi="Arial" w:cs="Arial" w:eastAsia="Arial"/>
-                <w:sz w:val="21"/>
-                <w:szCs w:val="21"/>
-              </w:rPr>
-            </w:pPr>
-            <w:r>
-              <w:rPr>
-                <w:rFonts w:ascii="Arial" w:hAnsi="Arial" w:cs="Arial" w:eastAsia="Arial"/>
-                <w:sz w:val="21"/>
-                <w:szCs w:val="21"/>
+              <w:spacing w:after="0"/>
+            </w:pPr>
+            <w:r>
+              <w:rPr>
+                <w:rFonts w:ascii="Arial" w:eastAsia="Arial" w:hAnsi="Arial" w:cs="Arial"/>
+                <w:sz w:val="21"/>
               </w:rPr>
               <w:t>Maintaining the original timestamps, including creation and modification dates and times, when transferring data to the destination cloud.</w:t>
             </w:r>
@@ -656,19 +467,14 @@
           </w:tcPr>
           <w:p>
             <w:pPr>
+              <w:spacing w:after="0"/>
               <w:ind w:left="3"/>
-              <w:rPr>
-                <w:rFonts w:ascii="Arial" w:hAnsi="Arial" w:cs="Arial" w:eastAsia="Arial"/>
-                <w:sz w:val="21"/>
-                <w:szCs w:val="21"/>
-              </w:rPr>
-            </w:pPr>
-            <w:r>
-              <w:rPr>
-                <w:rFonts w:ascii="Arial" w:hAnsi="Arial" w:cs="Arial" w:eastAsia="Arial"/>
+            </w:pPr>
+            <w:r>
+              <w:rPr>
+                <w:rFonts w:ascii="Arial" w:eastAsia="Arial" w:hAnsi="Arial" w:cs="Arial"/>
                 <w:b/>
                 <w:sz w:val="21"/>
-                <w:szCs w:val="21"/>
               </w:rPr>
               <w:t>In- Line Comment</w:t>
             </w:r>
@@ -686,17 +492,12 @@
           </w:tcPr>
           <w:p>
             <w:pPr>
-              <w:rPr>
-                <w:rFonts w:ascii="Arial" w:hAnsi="Arial" w:cs="Arial" w:eastAsia="Arial"/>
-                <w:sz w:val="21"/>
-                <w:szCs w:val="21"/>
-              </w:rPr>
-            </w:pPr>
-            <w:r>
-              <w:rPr>
-                <w:rFonts w:ascii="Arial" w:hAnsi="Arial" w:cs="Arial" w:eastAsia="Arial"/>
-                <w:sz w:val="21"/>
-                <w:szCs w:val="21"/>
+              <w:spacing w:after="0"/>
+            </w:pPr>
+            <w:r>
+              <w:rPr>
+                <w:rFonts w:ascii="Arial" w:eastAsia="Arial" w:hAnsi="Arial" w:cs="Arial"/>
+                <w:sz w:val="21"/>
               </w:rPr>
               <w:t>Inline file comments of the box will be migrated to the destination cloud. All the file comments will preserve in the CSV formatted file in the destination.</w:t>
             </w:r>
@@ -719,19 +520,14 @@
           </w:tcPr>
           <w:p>
             <w:pPr>
+              <w:spacing w:after="0"/>
               <w:ind w:left="3"/>
-              <w:rPr>
-                <w:rFonts w:ascii="Arial" w:hAnsi="Arial" w:cs="Arial" w:eastAsia="Arial"/>
-                <w:sz w:val="21"/>
-                <w:szCs w:val="21"/>
-              </w:rPr>
-            </w:pPr>
-            <w:r>
-              <w:rPr>
-                <w:rFonts w:ascii="Arial" w:hAnsi="Arial" w:cs="Arial" w:eastAsia="Arial"/>
+            </w:pPr>
+            <w:r>
+              <w:rPr>
+                <w:rFonts w:ascii="Arial" w:eastAsia="Arial" w:hAnsi="Arial" w:cs="Arial"/>
                 <w:b/>
                 <w:sz w:val="21"/>
-                <w:szCs w:val="21"/>
               </w:rPr>
               <w:t>Long File/Folder Path</w:t>
             </w:r>
@@ -749,17 +545,12 @@
           </w:tcPr>
           <w:p>
             <w:pPr>
-              <w:rPr>
-                <w:rFonts w:ascii="Arial" w:hAnsi="Arial" w:cs="Arial" w:eastAsia="Arial"/>
-                <w:sz w:val="21"/>
-                <w:szCs w:val="21"/>
-              </w:rPr>
-            </w:pPr>
-            <w:r>
-              <w:rPr>
-                <w:rFonts w:ascii="Arial" w:hAnsi="Arial" w:cs="Arial" w:eastAsia="Arial"/>
-                <w:sz w:val="21"/>
-                <w:szCs w:val="21"/>
+              <w:spacing w:after="0"/>
+            </w:pPr>
+            <w:r>
+              <w:rPr>
+                <w:rFonts w:ascii="Arial" w:eastAsia="Arial" w:hAnsi="Arial" w:cs="Arial"/>
+                <w:sz w:val="21"/>
               </w:rPr>
               <w:t>If the destination cloud has a long folder path limitation, the system automatically adjusts the destination's path as per the limitation.</w:t>
             </w:r>
@@ -782,19 +573,14 @@
           </w:tcPr>
           <w:p>
             <w:pPr>
+              <w:spacing w:after="0"/>
               <w:ind w:left="3"/>
-              <w:rPr>
-                <w:rFonts w:ascii="Arial" w:hAnsi="Arial" w:cs="Arial" w:eastAsia="Arial"/>
-                <w:sz w:val="21"/>
-                <w:szCs w:val="21"/>
-              </w:rPr>
-            </w:pPr>
-            <w:r>
-              <w:rPr>
-                <w:rFonts w:ascii="Arial" w:hAnsi="Arial" w:cs="Arial" w:eastAsia="Arial"/>
+            </w:pPr>
+            <w:r>
+              <w:rPr>
+                <w:rFonts w:ascii="Arial" w:eastAsia="Arial" w:hAnsi="Arial" w:cs="Arial"/>
                 <w:b/>
                 <w:sz w:val="21"/>
-                <w:szCs w:val="21"/>
               </w:rPr>
               <w:t>Special Character Replacement</w:t>
             </w:r>
@@ -812,17 +598,12 @@
           </w:tcPr>
           <w:p>
             <w:pPr>
-              <w:rPr>
-                <w:rFonts w:ascii="Arial" w:hAnsi="Arial" w:cs="Arial" w:eastAsia="Arial"/>
-                <w:sz w:val="21"/>
-                <w:szCs w:val="21"/>
-              </w:rPr>
-            </w:pPr>
-            <w:r>
-              <w:rPr>
-                <w:rFonts w:ascii="Arial" w:hAnsi="Arial" w:cs="Arial" w:eastAsia="Arial"/>
-                <w:sz w:val="21"/>
-                <w:szCs w:val="21"/>
+              <w:spacing w:after="0"/>
+            </w:pPr>
+            <w:r>
+              <w:rPr>
+                <w:rFonts w:ascii="Arial" w:eastAsia="Arial" w:hAnsi="Arial" w:cs="Arial"/>
+                <w:sz w:val="21"/>
               </w:rPr>
               <w:t>Special characters not supported by the destination cloud will be automatically replaced with underscores (_) or hyphens (-). This ensures that the integrity of the data is maintained during the migration process.</w:t>
             </w:r>
@@ -845,19 +626,14 @@
           </w:tcPr>
           <w:p>
             <w:pPr>
+              <w:spacing w:after="0"/>
               <w:ind w:left="3"/>
-              <w:rPr>
-                <w:rFonts w:ascii="Arial" w:hAnsi="Arial" w:cs="Arial" w:eastAsia="Arial"/>
-                <w:sz w:val="21"/>
-                <w:szCs w:val="21"/>
-              </w:rPr>
-            </w:pPr>
-            <w:r>
-              <w:rPr>
-                <w:rFonts w:ascii="Arial" w:hAnsi="Arial" w:cs="Arial" w:eastAsia="Arial"/>
+            </w:pPr>
+            <w:r>
+              <w:rPr>
+                <w:rFonts w:ascii="Arial" w:eastAsia="Arial" w:hAnsi="Arial" w:cs="Arial"/>
                 <w:b/>
                 <w:sz w:val="21"/>
-                <w:szCs w:val="21"/>
               </w:rPr>
               <w:t xml:space="preserve">Auto-Retry </w:t>
             </w:r>
@@ -875,17 +651,12 @@
           </w:tcPr>
           <w:p>
             <w:pPr>
-              <w:rPr>
-                <w:rFonts w:ascii="Arial" w:hAnsi="Arial" w:cs="Arial" w:eastAsia="Arial"/>
-                <w:sz w:val="21"/>
-                <w:szCs w:val="21"/>
-              </w:rPr>
-            </w:pPr>
-            <w:r>
-              <w:rPr>
-                <w:rFonts w:ascii="Arial" w:hAnsi="Arial" w:cs="Arial" w:eastAsia="Arial"/>
-                <w:sz w:val="21"/>
-                <w:szCs w:val="21"/>
+              <w:spacing w:after="0"/>
+            </w:pPr>
+            <w:r>
+              <w:rPr>
+                <w:rFonts w:ascii="Arial" w:eastAsia="Arial" w:hAnsi="Arial" w:cs="Arial"/>
+                <w:sz w:val="21"/>
               </w:rPr>
               <w:t>While doing migration if any file or folder went into error, our system retries automatically</w:t>
             </w:r>
@@ -908,10 +679,10 @@
   <w:docDefaults>
     <w:rPrDefault>
       <w:rPr>
-        <w:rFonts w:ascii="Arial" w:hAnsi="Arial" w:cs="Arial" w:eastAsia="Arial"/>
+        <w:rFonts w:asciiTheme="minorHAnsi" w:eastAsiaTheme="minorEastAsia" w:hAnsiTheme="minorHAnsi" w:cstheme="minorBidi"/>
         <w:kern w:val="2"/>
-        <w:sz w:val="21"/>
-        <w:szCs w:val="21"/>
+        <w:sz w:val="24"/>
+        <w:szCs w:val="24"/>
         <w:lang w:val="en-IN" w:eastAsia="en-IN" w:bidi="ar-SA"/>
         <w14:ligatures w14:val="standardContextual"/>
       </w:rPr>
@@ -1307,9 +1078,9 @@
       <w:spacing w:line="259" w:lineRule="auto"/>
     </w:pPr>
     <w:rPr>
-      <w:rFonts w:ascii="Arial" w:hAnsi="Arial" w:cs="Arial" w:eastAsia="Arial"/>
+      <w:rFonts w:ascii="Calibri" w:eastAsia="Calibri" w:hAnsi="Calibri" w:cs="Calibri"/>
       <w:color w:val="000000"/>
-      <w:sz w:val="21"/>
+      <w:sz w:val="22"/>
     </w:rPr>
   </w:style>
   <w:style w:type="character" w:default="1" w:styleId="DefaultParagraphFont">

</xml_diff>